<commit_message>
Update lab report with user-confirmed Packet Tracer results
</commit_message>
<xml_diff>
--- a/eigrp-lab/EIGRP_report_RU.docx
+++ b/eigrp-lab/EIGRP_report_RU.docx
@@ -22,7 +22,7 @@
     </w:p>
     <w:p>
       <w:r>
-        <w:t>Статус: созданы три проекта .pkt, конфигурации и теоретическое решение. Проекты сформированы программно в формате Packet Tracer 8.2.0.0162; структура проверена обратным чтением. Открытие в Cisco Packet Tracer 9.0.1, реальные выводы IOS, ping и скриншоты здесь не проверены. Перед сдачей нужно подтвердить работу в приложении и приложить реальные результаты.</w:t>
+        <w:t>Статус отчёта: настройки, ответы на вопросы и результаты статической проверки внесены. Пользователь открыл итоговый проект в Cisco Packet Tracer, предоставил общий снимок сети и сообщил: «всё работает». На снимке видны шесть устройств и зелёные индикаторы всех соединений. Выводы CLI, статистика ping и изображения проверок пока не предоставлены; перед сдачей их нужно добавить в раздел 8. ФИО и группа не указаны.</w:t>
       </w:r>
     </w:p>
     <w:p>
@@ -35,7 +35,7 @@
     </w:p>
     <w:p>
       <w:r>
-        <w:t>Для итоговой сети открыть EIGRP_AS10_final.pkt через File → Open. Конфигурации уже внесены. Для исходных измерений использовать projects/01_Direct_connectivity.pkt, для EIGRP до изменения метрик — projects/02_EIGRP_before_bandwidth.pkt. На консолях пароль cisco, для enable — class. При открытии дать сети время на установление соседств. Если версия приложения отклоняет формат, сохранить сообщение об ошибке: совместимость с 9.0.1 здесь не проверена.</w:t>
+        <w:t>Для итоговой сети открыть EIGRP_AS10_final.pkt через File → Open. Конфигурации уже внесены. Для исходных измерений использовать projects/01_Direct_connectivity.pkt, для EIGRP до изменения метрик — projects/02_EIGRP_before_bandwidth.pkt. На консолях пароль cisco, для enable — class. При открытии дать сети время на установление соседств. Открытие итогового проекта в установленном у пользователя приложении подтверждено присланным снимком. Точная версия приложения на снимке не показана; совместимость с каждой версией отдельно не проверялась.</w:t>
       </w:r>
     </w:p>
     <w:p>
@@ -1798,7 +1798,7 @@
     </w:p>
     <w:p>
       <w:r>
-        <w:t>Фактически в среде подготовки: документ задания прочитан, созданы три зашифрованных контейнера .pkt с шестью устройствами и шестью соединениями каждый, конфигурации сформированы и статически проверены на соответствие адресации и ролям DCE. Проверены уникальность MAC-адресов, записи running/startup-config и обратное чтение контейнеров. Проверки Cisco IOS и Packet Tracer не выполнялись. В таблицу ниже нужно добавить результаты собственного запуска; схемой topology.png нельзя заменять скриншот из Packet Tracer.</w:t>
+        <w:t>Фактически в среде подготовки: документ задания прочитан, созданы три зашифрованных контейнера .pkt с шестью устройствами и шестью соединениями каждый, конфигурации сформированы и статически проверены на соответствие адресации и ролям DCE. Проверены уникальность MAC-адресов, записи running/startup-config и обратное чтение контейнеров. В среде подготовки симуляция Cisco IOS не запускалась. В приложении пользователя проект открылся: это видно по предоставленному в переписке снимку с R1/R2/R3, PC1/PC2/PC3 и активными индикаторами шести соединений. Пользователь подтвердил общую работоспособность словами «всё работает». Точные результаты отдельных команд, соседства EIGRP и число успешных ping этим сообщением не документированы. Схемой topology.png нельзя заменять скриншот из Packet Tracer.</w:t>
       </w:r>
     </w:p>
     <w:tbl>
@@ -2231,7 +2231,7 @@
     </w:tbl>
     <w:p>
       <w:r>
-        <w:t>Для каждого номера допускается несколько скриншотов: например, 06_R1.png, 06_R2.png, 06_R3.png. Сохранять их в screenshots/ и вставить в этот Word-отчёт с подписью, устройством и этапом. ФИО и группу заполнить самостоятельно. Не подменять ожидаемые результаты выводами, которых не было.</w:t>
+        <w:t>Для каждого номера допускается несколько скриншотов: например, 06_R1.png, 06_R2.png, 06_R3.png. Сохранять их в screenshots/ и вставить в этот Word-отчёт с подписью, устройством и этапом. Предоставленный в переписке снимок топологии пока недоступен как отдельный файл для встраивания. Остальные снимки CLI и ping не предоставлены. ФИО и группу заполнить перед сдачей.</w:t>
       </w:r>
     </w:p>
     <w:tbl>
@@ -2252,7 +2252,7 @@
           </w:tcPr>
           <w:p>
             <w:r>
-              <w:t>Этап</w:t>
+              <w:t>Проверка</w:t>
             </w:r>
           </w:p>
         </w:tc>
@@ -2272,7 +2272,103 @@
           </w:tcPr>
           <w:p>
             <w:r>
-              <w:t>Факт</w:t>
+              <w:t>Подтверждённый результат</w:t>
+            </w:r>
+          </w:p>
+        </w:tc>
+      </w:tr>
+      <w:tr>
+        <w:tc>
+          <w:tcPr>
+            <w:tcW w:type="dxa" w:w="2880"/>
+          </w:tcPr>
+          <w:p>
+            <w:r>
+              <w:t>Открытие проекта</w:t>
+            </w:r>
+          </w:p>
+        </w:tc>
+        <w:tc>
+          <w:tcPr>
+            <w:tcW w:type="dxa" w:w="2880"/>
+          </w:tcPr>
+          <w:p>
+            <w:r>
+              <w:t>Видны все 6 устройств и соединения</w:t>
+            </w:r>
+          </w:p>
+        </w:tc>
+        <w:tc>
+          <w:tcPr>
+            <w:tcW w:type="dxa" w:w="2880"/>
+          </w:tcPr>
+          <w:p>
+            <w:r>
+              <w:t>Подтверждено снимком пользователя в переписке</w:t>
+            </w:r>
+          </w:p>
+        </w:tc>
+      </w:tr>
+      <w:tr>
+        <w:tc>
+          <w:tcPr>
+            <w:tcW w:type="dxa" w:w="2880"/>
+          </w:tcPr>
+          <w:p>
+            <w:r>
+              <w:t>Состояние соединений</w:t>
+            </w:r>
+          </w:p>
+        </w:tc>
+        <w:tc>
+          <w:tcPr>
+            <w:tcW w:type="dxa" w:w="2880"/>
+          </w:tcPr>
+          <w:p>
+            <w:r>
+              <w:t>Зелёные индикаторы на концах всех линий</w:t>
+            </w:r>
+          </w:p>
+        </w:tc>
+        <w:tc>
+          <w:tcPr>
+            <w:tcW w:type="dxa" w:w="2880"/>
+          </w:tcPr>
+          <w:p>
+            <w:r>
+              <w:t>На присланном снимке индикаторы зелёные</w:t>
+            </w:r>
+          </w:p>
+        </w:tc>
+      </w:tr>
+      <w:tr>
+        <w:tc>
+          <w:tcPr>
+            <w:tcW w:type="dxa" w:w="2880"/>
+          </w:tcPr>
+          <w:p>
+            <w:r>
+              <w:t>Общая работоспособность</w:t>
+            </w:r>
+          </w:p>
+        </w:tc>
+        <w:tc>
+          <w:tcPr>
+            <w:tcW w:type="dxa" w:w="2880"/>
+          </w:tcPr>
+          <w:p>
+            <w:r>
+              <w:t>Связь в настроенной сети</w:t>
+            </w:r>
+          </w:p>
+        </w:tc>
+        <w:tc>
+          <w:tcPr>
+            <w:tcW w:type="dxa" w:w="2880"/>
+          </w:tcPr>
+          <w:p>
+            <w:r>
+              <w:t>Пользователь сообщил: «всё работает»; точные тесты не указаны</w:t>
             </w:r>
           </w:p>
         </w:tc>
@@ -2304,7 +2400,7 @@
           </w:tcPr>
           <w:p>
             <w:r>
-              <w:t>Не выполнено</w:t>
+              <w:t>Выводы проверок не предоставлены</w:t>
             </w:r>
           </w:p>
         </w:tc>
@@ -2326,7 +2422,7 @@
           </w:tcPr>
           <w:p>
             <w:r>
-              <w:t>2 соседа/маршрутизатор; удалённые LAN с D; ping проходит</w:t>
+              <w:t>2 соседа; удалённые LAN с D; ping проходит</w:t>
             </w:r>
           </w:p>
         </w:tc>
@@ -2336,7 +2432,7 @@
           </w:tcPr>
           <w:p>
             <w:r>
-              <w:t>Не выполнено</w:t>
+              <w:t>Выводы CLI и ping не предоставлены</w:t>
             </w:r>
           </w:p>
         </w:tc>
@@ -2368,7 +2464,7 @@
           </w:tcPr>
           <w:p>
             <w:r>
-              <w:t>Не выполнено</w:t>
+              <w:t>Таблицы до/после не предоставлены</w:t>
             </w:r>
           </w:p>
         </w:tc>
@@ -2400,7 +2496,7 @@
           </w:tcPr>
           <w:p>
             <w:r>
-              <w:t>Не выполнено</w:t>
+              <w:t>Вывод show ip protocols не предоставлен</w:t>
             </w:r>
           </w:p>
         </w:tc>
@@ -2422,7 +2518,7 @@
           </w:tcPr>
           <w:p>
             <w:r>
-              <w:t>Связь через R2; затем восстановление двух соседей</w:t>
+              <w:t>Связь через R2; затем восстановление соседей</w:t>
             </w:r>
           </w:p>
         </w:tc>
@@ -2432,7 +2528,7 @@
           </w:tcPr>
           <w:p>
             <w:r>
-              <w:t>Не выполнено</w:t>
+              <w:t>Результат отдельного испытания не предоставлен</w:t>
             </w:r>
           </w:p>
         </w:tc>
@@ -2448,7 +2544,7 @@
     </w:p>
     <w:p>
       <w:r>
-        <w:t>Подготовлена конфигурация EIGRP AS 10 для трёх IPv4 LAN и трёх serial-сетей. Теоретический анализ показывает выбор пути через R2 после снижения логической bandwidth прямой линии R1–R3 и сохранение маршрутизации при пассивных LAN-интерфейсах. Итоговый проект .pkt и два промежуточных проекта подготовлены программно. Практическое подтверждение их работы и реальные скриншоты требуют запуска в Cisco Packet Tracer; до этого лабораторную работу нельзя считать полностью проверенной.</w:t>
+        <w:t>Подготовлена конфигурация EIGRP AS 10 для трёх IPv4 LAN и трёх serial-сетей. Теоретический анализ показывает выбор пути через R2 после снижения логической bandwidth прямой линии R1–R3 и сохранение маршрутизации при пассивных LAN-интерфейсах. Итоговый проект .pkt и два промежуточных проекта подготовлены программно. Открытие проекта и активное состояние линий подтверждаются снимком пользователя; общая работоспособность подтверждена его сообщением. Для окончательного оформления отчёта нужны реальные снимки выводов EIGRP, ping и сравнения маршрутов до/после изменения метрик. До добавления этих доказательств отчёт не полностью соответствует требованиям сдачи.</w:t>
       </w:r>
     </w:p>
     <w:p>

</xml_diff>